<commit_message>
Agregar explicabilidad SHAP para Random Forest y XGBoost
- src/visualization/explainability.py: nuevo modulo, compute_shap_explanation
  (TreeExplainer, exacto para modelos de arboles) mas plot_shap_global_importance
  (bar chart de |SHAP| promedio, calculado a mano por un bug de shap.plots.bar
  con explicaciones multiclase en esta version de la libreria) y
  plot_shap_local_explanation (waterfall por curva individual). Maneja la
  ausencia de shap con el mismo patron gracioso que xgboost/torch/mlflow.
- src/models/train.py: calcula la explicacion SHAP de RF y XGBoost sobre el
  test set dentro de run_full_training, protegida con _safe_shap.
- main.py: paso 8 del pipeline, genera las 4 figuras de SHAP.
- generar_informe.py: nueva seccion 6.5 (Explicabilidad SHAP) en el informe,
  y fix de un salto de numeracion (pasaba de 6.5 a "8. Proximos pasos").
- requirements.txt: agregado shap>=0.45.
</commit_message>
<xml_diff>
--- a/outputs/reports/informe_avance_tesis.docx
+++ b/outputs/reports/informe_avance_tesis.docx
@@ -434,7 +434,7 @@
           </w:tcPr>
           <w:p>
             <w:r>
-              <w:t>0.0106</w:t>
+              <w:t>0.0090</w:t>
             </w:r>
           </w:p>
         </w:tc>
@@ -444,7 +444,7 @@
           </w:tcPr>
           <w:p>
             <w:r>
-              <w:t>0.0089</w:t>
+              <w:t>0.0064</w:t>
             </w:r>
           </w:p>
         </w:tc>
@@ -454,7 +454,7 @@
           </w:tcPr>
           <w:p>
             <w:r>
-              <w:t>0.4935</w:t>
+              <w:t>0.6342</w:t>
             </w:r>
           </w:p>
         </w:tc>
@@ -1380,10 +1380,243 @@
     </w:p>
     <w:p>
       <w:pPr>
+        <w:pStyle w:val="Heading2"/>
+      </w:pPr>
+      <w:r>
+        <w:t>6.5. Explicabilidad (SHAP)</w:t>
+      </w:r>
+    </w:p>
+    <w:p>
+      <w:r>
+        <w:t>Se usó SHAP (TreeExplainer, exacto para modelos de árboles) para explicar las predicciones de Random Forest y XGBoost: importancia global (promedio de |valor SHAP| entre todas las curvas de test) y una explicación local (por qué el modelo clasificó una curva particular como lo hizo). Ambos modelos coinciden en que el peso molecular inicial (initial_mw_kDa) es la variable más influyente, seguida de la cristalinidad y el tipo de polímero (PGA en particular) — coherente con lo esperado fisicoquímicamente: mayor peso molecular y cristalinidad se asocian a degradación más lenta.</w:t>
+      </w:r>
+    </w:p>
+    <w:p>
+      <w:pPr>
+        <w:pStyle w:val="Heading3"/>
+      </w:pPr>
+      <w:r>
+        <w:t>Random Forest</w:t>
+      </w:r>
+    </w:p>
+    <w:p>
+      <w:pPr>
+        <w:jc w:val="center"/>
+      </w:pPr>
+      <w:r>
+        <w:drawing>
+          <wp:inline xmlns:a="http://schemas.openxmlformats.org/drawingml/2006/main" xmlns:pic="http://schemas.openxmlformats.org/drawingml/2006/picture">
+            <wp:extent cx="4680000" cy="3284608"/>
+            <wp:docPr id="9" name="Picture 9"/>
+            <wp:cNvGraphicFramePr>
+              <a:graphicFrameLocks noChangeAspect="1"/>
+            </wp:cNvGraphicFramePr>
+            <a:graphic>
+              <a:graphicData uri="http://schemas.openxmlformats.org/drawingml/2006/picture">
+                <pic:pic>
+                  <pic:nvPicPr>
+                    <pic:cNvPr id="0" name="shap_global_random_forest.png"/>
+                    <pic:cNvPicPr/>
+                  </pic:nvPicPr>
+                  <pic:blipFill>
+                    <a:blip r:embed="rId17"/>
+                    <a:stretch>
+                      <a:fillRect/>
+                    </a:stretch>
+                  </pic:blipFill>
+                  <pic:spPr>
+                    <a:xfrm>
+                      <a:off x="0" y="0"/>
+                      <a:ext cx="4680000" cy="3284608"/>
+                    </a:xfrm>
+                    <a:prstGeom prst="rect"/>
+                  </pic:spPr>
+                </pic:pic>
+              </a:graphicData>
+            </a:graphic>
+          </wp:inline>
+        </w:drawing>
+      </w:r>
+    </w:p>
+    <w:p>
+      <w:pPr>
+        <w:jc w:val="center"/>
+      </w:pPr>
+      <w:r>
+        <w:rPr>
+          <w:i/>
+          <w:sz w:val="20"/>
+        </w:rPr>
+        <w:t>Figura 9. Importancia global (SHAP) — Random Forest.</w:t>
+      </w:r>
+    </w:p>
+    <w:p>
+      <w:pPr>
+        <w:jc w:val="center"/>
+      </w:pPr>
+      <w:r>
+        <w:drawing>
+          <wp:inline xmlns:a="http://schemas.openxmlformats.org/drawingml/2006/main" xmlns:pic="http://schemas.openxmlformats.org/drawingml/2006/picture">
+            <wp:extent cx="5400000" cy="4379492"/>
+            <wp:docPr id="10" name="Picture 10"/>
+            <wp:cNvGraphicFramePr>
+              <a:graphicFrameLocks noChangeAspect="1"/>
+            </wp:cNvGraphicFramePr>
+            <a:graphic>
+              <a:graphicData uri="http://schemas.openxmlformats.org/drawingml/2006/picture">
+                <pic:pic>
+                  <pic:nvPicPr>
+                    <pic:cNvPr id="0" name="shap_local_random_forest.png"/>
+                    <pic:cNvPicPr/>
+                  </pic:nvPicPr>
+                  <pic:blipFill>
+                    <a:blip r:embed="rId18"/>
+                    <a:stretch>
+                      <a:fillRect/>
+                    </a:stretch>
+                  </pic:blipFill>
+                  <pic:spPr>
+                    <a:xfrm>
+                      <a:off x="0" y="0"/>
+                      <a:ext cx="5400000" cy="4379492"/>
+                    </a:xfrm>
+                    <a:prstGeom prst="rect"/>
+                  </pic:spPr>
+                </pic:pic>
+              </a:graphicData>
+            </a:graphic>
+          </wp:inline>
+        </w:drawing>
+      </w:r>
+    </w:p>
+    <w:p>
+      <w:pPr>
+        <w:jc w:val="center"/>
+      </w:pPr>
+      <w:r>
+        <w:rPr>
+          <w:i/>
+          <w:sz w:val="20"/>
+        </w:rPr>
+        <w:t>Figura 10. Explicación local (SHAP) de una curva de test — Random Forest.</w:t>
+      </w:r>
+    </w:p>
+    <w:p>
+      <w:pPr>
+        <w:pStyle w:val="Heading3"/>
+      </w:pPr>
+      <w:r>
+        <w:t>XGBoost</w:t>
+      </w:r>
+    </w:p>
+    <w:p>
+      <w:pPr>
+        <w:jc w:val="center"/>
+      </w:pPr>
+      <w:r>
+        <w:drawing>
+          <wp:inline xmlns:a="http://schemas.openxmlformats.org/drawingml/2006/main" xmlns:pic="http://schemas.openxmlformats.org/drawingml/2006/picture">
+            <wp:extent cx="4680000" cy="3284608"/>
+            <wp:docPr id="11" name="Picture 11"/>
+            <wp:cNvGraphicFramePr>
+              <a:graphicFrameLocks noChangeAspect="1"/>
+            </wp:cNvGraphicFramePr>
+            <a:graphic>
+              <a:graphicData uri="http://schemas.openxmlformats.org/drawingml/2006/picture">
+                <pic:pic>
+                  <pic:nvPicPr>
+                    <pic:cNvPr id="0" name="shap_global_xgboost.png"/>
+                    <pic:cNvPicPr/>
+                  </pic:nvPicPr>
+                  <pic:blipFill>
+                    <a:blip r:embed="rId19"/>
+                    <a:stretch>
+                      <a:fillRect/>
+                    </a:stretch>
+                  </pic:blipFill>
+                  <pic:spPr>
+                    <a:xfrm>
+                      <a:off x="0" y="0"/>
+                      <a:ext cx="4680000" cy="3284608"/>
+                    </a:xfrm>
+                    <a:prstGeom prst="rect"/>
+                  </pic:spPr>
+                </pic:pic>
+              </a:graphicData>
+            </a:graphic>
+          </wp:inline>
+        </w:drawing>
+      </w:r>
+    </w:p>
+    <w:p>
+      <w:pPr>
+        <w:jc w:val="center"/>
+      </w:pPr>
+      <w:r>
+        <w:rPr>
+          <w:i/>
+          <w:sz w:val="20"/>
+        </w:rPr>
+        <w:t>Figura 11. Importancia global (SHAP) — XGBoost.</w:t>
+      </w:r>
+    </w:p>
+    <w:p>
+      <w:pPr>
+        <w:jc w:val="center"/>
+      </w:pPr>
+      <w:r>
+        <w:drawing>
+          <wp:inline xmlns:a="http://schemas.openxmlformats.org/drawingml/2006/main" xmlns:pic="http://schemas.openxmlformats.org/drawingml/2006/picture">
+            <wp:extent cx="5400000" cy="4335403"/>
+            <wp:docPr id="12" name="Picture 12"/>
+            <wp:cNvGraphicFramePr>
+              <a:graphicFrameLocks noChangeAspect="1"/>
+            </wp:cNvGraphicFramePr>
+            <a:graphic>
+              <a:graphicData uri="http://schemas.openxmlformats.org/drawingml/2006/picture">
+                <pic:pic>
+                  <pic:nvPicPr>
+                    <pic:cNvPr id="0" name="shap_local_xgboost.png"/>
+                    <pic:cNvPicPr/>
+                  </pic:nvPicPr>
+                  <pic:blipFill>
+                    <a:blip r:embed="rId20"/>
+                    <a:stretch>
+                      <a:fillRect/>
+                    </a:stretch>
+                  </pic:blipFill>
+                  <pic:spPr>
+                    <a:xfrm>
+                      <a:off x="0" y="0"/>
+                      <a:ext cx="5400000" cy="4335403"/>
+                    </a:xfrm>
+                    <a:prstGeom prst="rect"/>
+                  </pic:spPr>
+                </pic:pic>
+              </a:graphicData>
+            </a:graphic>
+          </wp:inline>
+        </w:drawing>
+      </w:r>
+    </w:p>
+    <w:p>
+      <w:pPr>
+        <w:jc w:val="center"/>
+      </w:pPr>
+      <w:r>
+        <w:rPr>
+          <w:i/>
+          <w:sz w:val="20"/>
+        </w:rPr>
+        <w:t>Figura 12. Explicación local (SHAP) de una curva de test — XGBoost.</w:t>
+      </w:r>
+    </w:p>
+    <w:p>
+      <w:pPr>
         <w:pStyle w:val="Heading1"/>
       </w:pPr>
       <w:r>
-        <w:t>8. Próximos pasos</w:t>
+        <w:t>7. Próximos pasos</w:t>
       </w:r>
     </w:p>
     <w:p>

</xml_diff>

<commit_message>
Generar informes de metricas y desempeno con resultados reales
- generar_informe.py: parametrizado por --source (sintetico|real) para
  reutilizar el mismo generador con ambos datasets; actualiza
  informe_avance_tesis.docx con los resultados reales (78 curvas, nucleo)
  y contexto especifico (bins recalibrados, hallazgo SHAP de PLGA).
- generar_informe_metricas.py (nuevo): informe corto solo de metricas y
  desempeno (sin metodologia/objetivos) para los 3 modelos sobre datos
  reales.
- generar_informe_comparativo.py (nuevo): informe lado a lado sintetico vs.
  real -- cuadro comparativo, discusion de por que baja el accuracy de
  clasificacion pero mejora el R2 del LSTM, y contraste de SHAP (peso
  molecular vs. composicion de copolimero PLGA).
- .gitignore: ignora los .png/.csv de outputs/figures_real y
  outputs/reports_real (respaldo de la corrida real, mismo criterio que
  outputs/figures y outputs/reports).
</commit_message>
<xml_diff>
--- a/outputs/reports/informe_avance_tesis.docx
+++ b/outputs/reports/informe_avance_tesis.docx
@@ -23,7 +23,7 @@
           <w:i/>
           <w:sz w:val="32"/>
         </w:rPr>
-        <w:t>Informe de avance</w:t>
+        <w:t>Informe de avance — dataset real (HU1)</w:t>
       </w:r>
     </w:p>
     <w:p/>
@@ -79,7 +79,7 @@
     </w:p>
     <w:p>
       <w:r>
-        <w:t>El pipeline corre de punta a punta (CRISP-DM completo) con datos sintéticos generados mediante una cinética de pseudo-primer orden fisicoquímicamente plausible, mientras avanza en paralelo la extracción real de curvas desde publicaciones científicas (HU1, Épica 1, pendiente). Esto permitió desarrollar y validar el resto del pipeline (preprocesamiento, modelado, evaluación, visualización, tracking de experimentos) sin depender de tener primero el dataset bibliográfico completo. Cuando la extracción esté lista, se reemplaza el CSV sintético por el real (mismo esquema) y se vuelve a correr el pipeline sin cambios de código.</w:t>
+        <w:t>El pipeline ya corre de punta a punta sobre el dataset REAL extraído de publicaciones científicas (HU1, Épica 1, completada): 4689 puntos, 120 curvas, 27 papers, filtrados al subconjunto 'núcleo' (78 curvas) comparable a medios fisiológicos (PBS/SBF/saliva artificial a ~37°C), excluyendo condiciones extremas (NaOH, pH extremo) y ensayos acelerados. El esquema de datos se extendió respecto del sintético para aprovechar variables no disponibles antes: composición de copolímero, geometría, método de fabricación y porosidad.</w:t>
       </w:r>
     </w:p>
     <w:p>
@@ -100,7 +100,7 @@
         <w:pStyle w:val="ListBullet"/>
       </w:pPr>
       <w:r>
-        <w:t>Generación / carga de datos (sintéticos, mientras se completa HU1 con datos reales).</w:t>
+        <w:t>Carga de datos (sintéticos o reales, según el archivo de configuración).</w:t>
       </w:r>
     </w:p>
     <w:p>
@@ -145,6 +145,14 @@
     </w:p>
     <w:p>
       <w:pPr>
+        <w:pStyle w:val="ListBullet"/>
+      </w:pPr>
+      <w:r>
+        <w:t>Evaluación detallada de clasificación (matrices de confusión, ROC/AUC) y explicabilidad (SHAP) para Random Forest y XGBoost.</w:t>
+      </w:r>
+    </w:p>
+    <w:p>
+      <w:pPr>
         <w:pStyle w:val="Heading1"/>
       </w:pPr>
       <w:r>
@@ -153,12 +161,12 @@
     </w:p>
     <w:p>
       <w:r>
-        <w:t>Dataset sintético actual: 80 curvas, con la siguiente distribución de clases de tasa de degradación: baja=47, media=14, alta=19.</w:t>
+        <w:t>Dataset actual: 78 curvas, con la siguiente distribución de clases de tasa de degradación: baja=26, media=28, alta=24.</w:t>
       </w:r>
     </w:p>
     <w:p>
       <w:r>
-        <w:t>Cada curva incluye: tipo de polímero (PLA, PCL, PGA, PLGA, etc.), medio de ensayo (SBF, PBS, etc.), temperatura, pH, peso molecular inicial, cristalinidad, área superficial, y la serie temporal de pérdida de masa. Este esquema es el mismo que se usará al incorporar las curvas reales extraídas de publicaciones (HU1).</w:t>
+        <w:t>Cada curva incluye: familia de polímero (incluye blends, ej. PCL/PLLA, PLLA/PLGA/PCL), fracciones de composición de copolímero (PLLA/PLGA/PCL/PEG, y lactide:glycolide dentro de PLGA), geometría (scaffold, film, mesh, fibra, etc.), método de fabricación, porosidad, medio de ensayo, temperatura, pH, peso molecular inicial, y la serie temporal de pérdida de masa. No incluye cristalinidad ni área superficial (no reportadas en la literatura relevada).</w:t>
       </w:r>
     </w:p>
     <w:p>
@@ -210,7 +218,7 @@
     </w:p>
     <w:p>
       <w:r>
-        <w:t>Cuadro comparativo de la corrida más reciente (80 curvas sintéticas, semilla 42):</w:t>
+        <w:t>Cuadro comparativo de la corrida más reciente (78 curvas reales, nivel de homogeneidad 'núcleo'):</w:t>
       </w:r>
     </w:p>
     <w:tbl>
@@ -306,7 +314,7 @@
           </w:tcPr>
           <w:p>
             <w:r>
-              <w:t>1.0000</w:t>
+              <w:t>0.7500</w:t>
             </w:r>
           </w:p>
         </w:tc>
@@ -316,7 +324,7 @@
           </w:tcPr>
           <w:p>
             <w:r>
-              <w:t>1.0000</w:t>
+              <w:t>0.7609</w:t>
             </w:r>
           </w:p>
         </w:tc>
@@ -362,7 +370,7 @@
           </w:tcPr>
           <w:p>
             <w:r>
-              <w:t>0.9375</w:t>
+              <w:t>0.6875</w:t>
             </w:r>
           </w:p>
         </w:tc>
@@ -372,7 +380,7 @@
           </w:tcPr>
           <w:p>
             <w:r>
-              <w:t>0.9434</w:t>
+              <w:t>0.6940</w:t>
             </w:r>
           </w:p>
         </w:tc>
@@ -434,7 +442,7 @@
           </w:tcPr>
           <w:p>
             <w:r>
-              <w:t>0.0090</w:t>
+              <w:t>0.0031</w:t>
             </w:r>
           </w:p>
         </w:tc>
@@ -444,7 +452,7 @@
           </w:tcPr>
           <w:p>
             <w:r>
-              <w:t>0.0064</w:t>
+              <w:t>0.0020</w:t>
             </w:r>
           </w:p>
         </w:tc>
@@ -454,7 +462,7 @@
           </w:tcPr>
           <w:p>
             <w:r>
-              <w:t>0.6342</w:t>
+              <w:t>0.7680</w:t>
             </w:r>
           </w:p>
         </w:tc>
@@ -463,7 +471,7 @@
     <w:p/>
     <w:p>
       <w:r>
-        <w:t>Random Forest y XGBoost clasifican con accuracy alto (1.00 y 0.94 respectivamente) sobre el conjunto de test. El LSTM predice k con un error absoluto medio (MAE) de ~0.006 día⁻¹ y R²≈0.64, con mejor ajuste en curvas de degradación rápida que en las de degradación lenta.</w:t>
+        <w:t>Random Forest (accuracy 0.75) y XGBoost (accuracy 0.69) clasifican con desempeño más modesto que sobre datos sintéticos, esperable dado el ruido y la heterogeneidad real entre 27 estudios distintos. El LSTM predice k con MAE≈0.002 día⁻¹ y R²≈0.77. Nota: los bins de clasificación (baja/media/alta) se recalibraron por terciles de la distribución real de k — los bins originales (pensados para el rango sintético) dejaban la clase 'alta' vacía, porque el k fisiológico real es 10-100x menor. Esta recalibración es provisoria y debe validarse con la dirección antes de reportar resultados finales.</w:t>
       </w:r>
     </w:p>
     <w:p>
@@ -532,7 +540,7 @@
       <w:r>
         <w:drawing>
           <wp:inline xmlns:a="http://schemas.openxmlformats.org/drawingml/2006/main" xmlns:pic="http://schemas.openxmlformats.org/drawingml/2006/picture">
-            <wp:extent cx="4320000" cy="3955774"/>
+            <wp:extent cx="4320000" cy="3995631"/>
             <wp:docPr id="2" name="Picture 2"/>
             <wp:cNvGraphicFramePr>
               <a:graphicFrameLocks noChangeAspect="1"/>
@@ -553,7 +561,7 @@
                   <pic:spPr>
                     <a:xfrm>
                       <a:off x="0" y="0"/>
-                      <a:ext cx="4320000" cy="3955774"/>
+                      <a:ext cx="4320000" cy="3995631"/>
                     </a:xfrm>
                     <a:prstGeom prst="rect"/>
                   </pic:spPr>
@@ -591,7 +599,7 @@
       <w:r>
         <w:drawing>
           <wp:inline xmlns:a="http://schemas.openxmlformats.org/drawingml/2006/main" xmlns:pic="http://schemas.openxmlformats.org/drawingml/2006/picture">
-            <wp:extent cx="5040000" cy="3836660"/>
+            <wp:extent cx="5040000" cy="2959075"/>
             <wp:docPr id="3" name="Picture 3"/>
             <wp:cNvGraphicFramePr>
               <a:graphicFrameLocks noChangeAspect="1"/>
@@ -612,7 +620,7 @@
                   <pic:spPr>
                     <a:xfrm>
                       <a:off x="0" y="0"/>
-                      <a:ext cx="5040000" cy="3836660"/>
+                      <a:ext cx="5040000" cy="2959075"/>
                     </a:xfrm>
                     <a:prstGeom prst="rect"/>
                   </pic:spPr>
@@ -655,7 +663,7 @@
       <w:r>
         <w:drawing>
           <wp:inline xmlns:a="http://schemas.openxmlformats.org/drawingml/2006/main" xmlns:pic="http://schemas.openxmlformats.org/drawingml/2006/picture">
-            <wp:extent cx="6120000" cy="1658499"/>
+            <wp:extent cx="6120000" cy="1659119"/>
             <wp:docPr id="4" name="Picture 4"/>
             <wp:cNvGraphicFramePr>
               <a:graphicFrameLocks noChangeAspect="1"/>
@@ -676,7 +684,7 @@
                   <pic:spPr>
                     <a:xfrm>
                       <a:off x="0" y="0"/>
-                      <a:ext cx="6120000" cy="1658499"/>
+                      <a:ext cx="6120000" cy="1659119"/>
                     </a:xfrm>
                     <a:prstGeom prst="rect"/>
                   </pic:spPr>
@@ -802,7 +810,7 @@
           </w:tcPr>
           <w:p>
             <w:r>
-              <w:t>1.000</w:t>
+              <w:t>0.571</w:t>
             </w:r>
           </w:p>
         </w:tc>
@@ -812,7 +820,7 @@
           </w:tcPr>
           <w:p>
             <w:r>
-              <w:t>1.000</w:t>
+              <w:t>0.800</w:t>
             </w:r>
           </w:p>
         </w:tc>
@@ -822,7 +830,7 @@
           </w:tcPr>
           <w:p>
             <w:r>
-              <w:t>1.000</w:t>
+              <w:t>0.667</w:t>
             </w:r>
           </w:p>
         </w:tc>
@@ -832,7 +840,7 @@
           </w:tcPr>
           <w:p>
             <w:r>
-              <w:t>9</w:t>
+              <w:t>5</w:t>
             </w:r>
           </w:p>
         </w:tc>
@@ -854,7 +862,7 @@
           </w:tcPr>
           <w:p>
             <w:r>
-              <w:t>1.000</w:t>
+              <w:t>0.800</w:t>
             </w:r>
           </w:p>
         </w:tc>
@@ -864,7 +872,7 @@
           </w:tcPr>
           <w:p>
             <w:r>
-              <w:t>1.000</w:t>
+              <w:t>0.667</w:t>
             </w:r>
           </w:p>
         </w:tc>
@@ -874,7 +882,7 @@
           </w:tcPr>
           <w:p>
             <w:r>
-              <w:t>1.000</w:t>
+              <w:t>0.727</w:t>
             </w:r>
           </w:p>
         </w:tc>
@@ -884,7 +892,7 @@
           </w:tcPr>
           <w:p>
             <w:r>
-              <w:t>3</w:t>
+              <w:t>6</w:t>
             </w:r>
           </w:p>
         </w:tc>
@@ -916,7 +924,7 @@
           </w:tcPr>
           <w:p>
             <w:r>
-              <w:t>1.000</w:t>
+              <w:t>0.800</w:t>
             </w:r>
           </w:p>
         </w:tc>
@@ -926,7 +934,7 @@
           </w:tcPr>
           <w:p>
             <w:r>
-              <w:t>1.000</w:t>
+              <w:t>0.889</w:t>
             </w:r>
           </w:p>
         </w:tc>
@@ -936,7 +944,7 @@
           </w:tcPr>
           <w:p>
             <w:r>
-              <w:t>4</w:t>
+              <w:t>5</w:t>
             </w:r>
           </w:p>
         </w:tc>
@@ -950,7 +958,7 @@
       <w:r>
         <w:drawing>
           <wp:inline xmlns:a="http://schemas.openxmlformats.org/drawingml/2006/main" xmlns:pic="http://schemas.openxmlformats.org/drawingml/2006/picture">
-            <wp:extent cx="3240000" cy="2957182"/>
+            <wp:extent cx="3240000" cy="2873571"/>
             <wp:docPr id="5" name="Picture 5"/>
             <wp:cNvGraphicFramePr>
               <a:graphicFrameLocks noChangeAspect="1"/>
@@ -971,7 +979,7 @@
                   <pic:spPr>
                     <a:xfrm>
                       <a:off x="0" y="0"/>
-                      <a:ext cx="3240000" cy="2957182"/>
+                      <a:ext cx="3240000" cy="2873571"/>
                     </a:xfrm>
                     <a:prstGeom prst="rect"/>
                   </pic:spPr>
@@ -1135,7 +1143,7 @@
           </w:tcPr>
           <w:p>
             <w:r>
-              <w:t>1.000</w:t>
+              <w:t>0.500</w:t>
             </w:r>
           </w:p>
         </w:tc>
@@ -1145,7 +1153,7 @@
           </w:tcPr>
           <w:p>
             <w:r>
-              <w:t>0.889</w:t>
+              <w:t>0.800</w:t>
             </w:r>
           </w:p>
         </w:tc>
@@ -1155,7 +1163,7 @@
           </w:tcPr>
           <w:p>
             <w:r>
-              <w:t>0.941</w:t>
+              <w:t>0.615</w:t>
             </w:r>
           </w:p>
         </w:tc>
@@ -1165,7 +1173,7 @@
           </w:tcPr>
           <w:p>
             <w:r>
-              <w:t>9</w:t>
+              <w:t>5</w:t>
             </w:r>
           </w:p>
         </w:tc>
@@ -1197,7 +1205,7 @@
           </w:tcPr>
           <w:p>
             <w:r>
-              <w:t>1.000</w:t>
+              <w:t>0.500</w:t>
             </w:r>
           </w:p>
         </w:tc>
@@ -1207,7 +1215,7 @@
           </w:tcPr>
           <w:p>
             <w:r>
-              <w:t>1.000</w:t>
+              <w:t>0.667</w:t>
             </w:r>
           </w:p>
         </w:tc>
@@ -1217,7 +1225,7 @@
           </w:tcPr>
           <w:p>
             <w:r>
-              <w:t>3</w:t>
+              <w:t>6</w:t>
             </w:r>
           </w:p>
         </w:tc>
@@ -1249,7 +1257,7 @@
           </w:tcPr>
           <w:p>
             <w:r>
-              <w:t>1.000</w:t>
+              <w:t>0.800</w:t>
             </w:r>
           </w:p>
         </w:tc>
@@ -1259,7 +1267,7 @@
           </w:tcPr>
           <w:p>
             <w:r>
-              <w:t>0.889</w:t>
+              <w:t>0.800</w:t>
             </w:r>
           </w:p>
         </w:tc>
@@ -1269,7 +1277,7 @@
           </w:tcPr>
           <w:p>
             <w:r>
-              <w:t>4</w:t>
+              <w:t>5</w:t>
             </w:r>
           </w:p>
         </w:tc>
@@ -1283,7 +1291,7 @@
       <w:r>
         <w:drawing>
           <wp:inline xmlns:a="http://schemas.openxmlformats.org/drawingml/2006/main" xmlns:pic="http://schemas.openxmlformats.org/drawingml/2006/picture">
-            <wp:extent cx="3240000" cy="2957182"/>
+            <wp:extent cx="3240000" cy="2873571"/>
             <wp:docPr id="7" name="Picture 7"/>
             <wp:cNvGraphicFramePr>
               <a:graphicFrameLocks noChangeAspect="1"/>
@@ -1304,7 +1312,7 @@
                   <pic:spPr>
                     <a:xfrm>
                       <a:off x="0" y="0"/>
-                      <a:ext cx="3240000" cy="2957182"/>
+                      <a:ext cx="3240000" cy="2873571"/>
                     </a:xfrm>
                     <a:prstGeom prst="rect"/>
                   </pic:spPr>
@@ -1388,7 +1396,7 @@
     </w:p>
     <w:p>
       <w:r>
-        <w:t>Se usó SHAP (TreeExplainer, exacto para modelos de árboles) para explicar las predicciones de Random Forest y XGBoost: importancia global (promedio de |valor SHAP| entre todas las curvas de test) y una explicación local (por qué el modelo clasificó una curva particular como lo hizo). Ambos modelos coinciden en que el peso molecular inicial (initial_mw_kDa) es la variable más influyente, seguida de la cristalinidad y el tipo de polímero (PGA en particular) — coherente con lo esperado fisicoquímicamente: mayor peso molecular y cristalinidad se asocian a degradación más lenta.</w:t>
+        <w:t>Se usó SHAP (TreeExplainer, exacto para modelos de árboles) para explicar las predicciones de Random Forest y XGBoost: importancia global (promedio de |valor SHAP| entre todas las curvas de test) y una explicación local (por qué el modelo clasificó una curva particular como lo hizo). A diferencia del dataset sintético, acá emerge una señal fisicoquímica muy concreta: la fracción de PLGA (plga_fraction) y las fracciones de láctico/glicólico dentro del PLGA (lactide/glycolide_fraction_in_plga) son las variables más influyentes en ambos modelos — coincide exactamente con la literatura: la proporción láctico:glicólico es el factor clásico que gobierna la velocidad de degradación del PLGA. Esta señal era invisible con el esquema sintético/mínimo, que solo tenía 'tipo de polímero' como categoría única.</w:t>
       </w:r>
     </w:p>
     <w:p>
@@ -1406,7 +1414,7 @@
       <w:r>
         <w:drawing>
           <wp:inline xmlns:a="http://schemas.openxmlformats.org/drawingml/2006/main" xmlns:pic="http://schemas.openxmlformats.org/drawingml/2006/picture">
-            <wp:extent cx="4680000" cy="3284608"/>
+            <wp:extent cx="4680000" cy="3256238"/>
             <wp:docPr id="9" name="Picture 9"/>
             <wp:cNvGraphicFramePr>
               <a:graphicFrameLocks noChangeAspect="1"/>
@@ -1427,7 +1435,7 @@
                   <pic:spPr>
                     <a:xfrm>
                       <a:off x="0" y="0"/>
-                      <a:ext cx="4680000" cy="3284608"/>
+                      <a:ext cx="4680000" cy="3256238"/>
                     </a:xfrm>
                     <a:prstGeom prst="rect"/>
                   </pic:spPr>
@@ -1457,7 +1465,7 @@
       <w:r>
         <w:drawing>
           <wp:inline xmlns:a="http://schemas.openxmlformats.org/drawingml/2006/main" xmlns:pic="http://schemas.openxmlformats.org/drawingml/2006/picture">
-            <wp:extent cx="5400000" cy="4379492"/>
+            <wp:extent cx="5400000" cy="4274442"/>
             <wp:docPr id="10" name="Picture 10"/>
             <wp:cNvGraphicFramePr>
               <a:graphicFrameLocks noChangeAspect="1"/>
@@ -1478,7 +1486,7 @@
                   <pic:spPr>
                     <a:xfrm>
                       <a:off x="0" y="0"/>
-                      <a:ext cx="5400000" cy="4379492"/>
+                      <a:ext cx="5400000" cy="4274442"/>
                     </a:xfrm>
                     <a:prstGeom prst="rect"/>
                   </pic:spPr>
@@ -1516,7 +1524,7 @@
       <w:r>
         <w:drawing>
           <wp:inline xmlns:a="http://schemas.openxmlformats.org/drawingml/2006/main" xmlns:pic="http://schemas.openxmlformats.org/drawingml/2006/picture">
-            <wp:extent cx="4680000" cy="3284608"/>
+            <wp:extent cx="4680000" cy="3271938"/>
             <wp:docPr id="11" name="Picture 11"/>
             <wp:cNvGraphicFramePr>
               <a:graphicFrameLocks noChangeAspect="1"/>
@@ -1537,7 +1545,7 @@
                   <pic:spPr>
                     <a:xfrm>
                       <a:off x="0" y="0"/>
-                      <a:ext cx="4680000" cy="3284608"/>
+                      <a:ext cx="4680000" cy="3271938"/>
                     </a:xfrm>
                     <a:prstGeom prst="rect"/>
                   </pic:spPr>
@@ -1567,7 +1575,7 @@
       <w:r>
         <w:drawing>
           <wp:inline xmlns:a="http://schemas.openxmlformats.org/drawingml/2006/main" xmlns:pic="http://schemas.openxmlformats.org/drawingml/2006/picture">
-            <wp:extent cx="5400000" cy="4335403"/>
+            <wp:extent cx="5400000" cy="4292193"/>
             <wp:docPr id="12" name="Picture 12"/>
             <wp:cNvGraphicFramePr>
               <a:graphicFrameLocks noChangeAspect="1"/>
@@ -1588,7 +1596,7 @@
                   <pic:spPr>
                     <a:xfrm>
                       <a:off x="0" y="0"/>
-                      <a:ext cx="5400000" cy="4335403"/>
+                      <a:ext cx="5400000" cy="4292193"/>
                     </a:xfrm>
                     <a:prstGeom prst="rect"/>
                   </pic:spPr>
@@ -1624,7 +1632,7 @@
         <w:pStyle w:val="ListBullet"/>
       </w:pPr>
       <w:r>
-        <w:t>HU1 (Épica 1): extracción real de curvas desde publicaciones científicas con WebPlotDigitizer, y reemplazo del dataset sintético.</w:t>
+        <w:t>Validar con la dirección los bins de clasificación baja/media/alta (actualmente por terciles de k, no por literatura clínica).</w:t>
       </w:r>
     </w:p>
     <w:p>
@@ -1632,7 +1640,15 @@
         <w:pStyle w:val="ListBullet"/>
       </w:pPr>
       <w:r>
-        <w:t>Re-evaluar los 3 modelos sobre el dataset real y comparar contra el desempeño obtenido con datos sintéticos.</w:t>
+        <w:t>Revisar curvas con ajuste cinético de mala calidad (R² bajo o negativo, ej. por curvas no monótonas o con pocos puntos) y decidir si se filtran.</w:t>
+      </w:r>
+    </w:p>
+    <w:p>
+      <w:pPr>
+        <w:pStyle w:val="ListBullet"/>
+      </w:pPr>
+      <w:r>
+        <w:t>Evaluar incorporar los niveles 'acelerado' y 'extendido' (con la normalización a k equivalente a 37°C ya calculada en el dataset) para ampliar la muestra.</w:t>
       </w:r>
     </w:p>
     <w:p>

</xml_diff>